<commit_message>
align syllabus fields to 2025 program: engineering-modeling semester 3->2, additive-manufacturing add semester 7
</commit_message>
<xml_diff>
--- a/course/增材制造技术/2025/大纲/25JD32407-增材制造技术-课程教学大纲.docx
+++ b/course/增材制造技术/2025/大纲/25JD32407-增材制造技术-课程教学大纲.docx
@@ -190,14 +190,13 @@
                 <w:rFonts w:hint="eastAsia"/>
                 <w:szCs w:val="21"/>
               </w:rPr>
-              <w:t>3D</w:t>
+              <w:t>增材制造技术</w:t>
             </w:r>
             <w:r>
               <w:rPr>
                 <w:rFonts w:hint="eastAsia"/>
                 <w:szCs w:val="21"/>
               </w:rPr>
-              <w:t>打印技术</w:t>
             </w:r>
           </w:p>
         </w:tc>
@@ -382,35 +381,31 @@
                 <w:rFonts w:hint="eastAsia"/>
                 <w:szCs w:val="21"/>
               </w:rPr>
-              <w:t>2</w:t>
+              <w:t>2学分/32学时（第7学期）</w:t>
             </w:r>
             <w:r>
               <w:rPr>
                 <w:rFonts w:hint="eastAsia"/>
                 <w:szCs w:val="21"/>
               </w:rPr>
-              <w:t>学分</w:t>
             </w:r>
             <w:r>
               <w:rPr>
                 <w:rFonts w:hint="eastAsia"/>
                 <w:szCs w:val="21"/>
               </w:rPr>
-              <w:t>/</w:t>
             </w:r>
             <w:r>
               <w:rPr>
                 <w:rFonts w:hint="eastAsia"/>
                 <w:szCs w:val="21"/>
               </w:rPr>
-              <w:t>32</w:t>
             </w:r>
             <w:r>
               <w:rPr>
                 <w:rFonts w:hint="eastAsia"/>
                 <w:szCs w:val="21"/>
               </w:rPr>
-              <w:t>学时</w:t>
             </w:r>
           </w:p>
         </w:tc>

</xml_diff>